<commit_message>
PRD and TRD v1.1: people management built, time zone decisions, multi time zone in v1.1
- D3/D4 and T4/T5 resolved; FR-06, FR-20, FR-22 built; FR-21 in progress
- FR-64 multiple time zones (home time zone per person) added to v1.1
- TRD: migration 004 tables, time zone design (10.1), requester_time_zone
- Docs are updated after each merged feature; build script for Word/PDF

Co-Authored-By: Claude Opus 5.5 <noreply@anthropic.com>
Claude-Session: https://claude.ai/code/session_01HeJF1Y197Q7LrJLGGjCvL1
</commit_message>
<xml_diff>
--- a/docs/files/AAS_Time_Off_Planner_PRD.docx
+++ b/docs/files/AAS_Time_Off_Planner_PRD.docx
@@ -57,25 +57,7 @@
         <w:t xml:space="preserve"> </w:t>
       </w:r>
       <w:r>
-        <w:t xml:space="preserve">1.0</w:t>
-      </w:r>
-      <w:r>
-        <w:t xml:space="preserve"> </w:t>
-      </w:r>
-      <w:r>
-        <w:t xml:space="preserve">draft</w:t>
-      </w:r>
-      <w:r>
-        <w:t xml:space="preserve"> </w:t>
-      </w:r>
-      <w:r>
-        <w:t xml:space="preserve">for</w:t>
-      </w:r>
-      <w:r>
-        <w:t xml:space="preserve"> </w:t>
-      </w:r>
-      <w:r>
-        <w:t xml:space="preserve">review</w:t>
+        <w:t xml:space="preserve">1.1</w:t>
       </w:r>
     </w:p>
     <w:p>
@@ -238,7 +220,7 @@
               <w:jc w:val="left"/>
             </w:pPr>
             <w:r>
-              <w:t xml:space="preserve">1.0, draft for review</w:t>
+              <w:t xml:space="preserve">1.1 (see change log, section 13)</w:t>
             </w:r>
           </w:p>
         </w:tc>
@@ -377,7 +359,7 @@
               <w:jc w:val="left"/>
             </w:pPr>
             <w:r>
-              <w:t xml:space="preserve">Company setup, company data separation, short labels, email sign-in and two-step sign-in are built and merged to</w:t>
+              <w:t xml:space="preserve">Built and merged to</w:t>
             </w:r>
             <w:r>
               <w:t xml:space="preserve"> </w:t>
@@ -387,6 +369,9 @@
                 <w:rStyle w:val="VerbatimChar"/>
               </w:rPr>
               <w:t xml:space="preserve">main</w:t>
+            </w:r>
+            <w:r>
+              <w:t xml:space="preserve">: company setup, company data separation, short labels, email sign-in, two-step sign-in, people management, company settings</w:t>
             </w:r>
           </w:p>
         </w:tc>
@@ -1668,7 +1653,7 @@
               <w:jc w:val="left"/>
             </w:pPr>
             <w:r>
-              <w:t xml:space="preserve">Direct Google and Microsoft 365 calendar push; Jira absence issues; availability API and webhooks for Jira Automation; utilisation and payroll reconciliation reports; API keys; dark and light mode switch with dark default</w:t>
+              <w:t xml:space="preserve">Direct Google and Microsoft 365 calendar push; Jira absence issues; availability API and webhooks for Jira Automation; utilisation and payroll reconciliation reports; API keys; dark and light mode switch with dark default; multiple time zones (home time zone per person)</w:t>
             </w:r>
           </w:p>
         </w:tc>
@@ -2389,7 +2374,7 @@
               <w:t xml:space="preserve">”</w:t>
             </w:r>
             <w:r>
-              <w:t xml:space="preserve">, approval deadlines and year-end processing.</w:t>
+              <w:t xml:space="preserve">, approval deadlines and year-end processing (default America/Toronto in Canada, America/New_York in the US).</w:t>
             </w:r>
           </w:p>
         </w:tc>
@@ -2425,7 +2410,7 @@
               <w:jc w:val="left"/>
             </w:pPr>
             <w:r>
-              <w:t xml:space="preserve">Pending (gap found while writing this PRD)</w:t>
+              <w:t xml:space="preserve">Built (setting); used by the accrual engine when built</w:t>
             </w:r>
           </w:p>
         </w:tc>
@@ -2962,11 +2947,11 @@
         </w:tblBorders>
       </w:tblPr>
       <w:tblGrid>
-        <w:gridCol w:w="678"/>
-        <w:gridCol w:w="2715"/>
-        <w:gridCol w:w="678"/>
-        <w:gridCol w:w="2376"/>
-        <w:gridCol w:w="1470"/>
+        <w:gridCol w:w="565"/>
+        <w:gridCol w:w="2262"/>
+        <w:gridCol w:w="565"/>
+        <w:gridCol w:w="2262"/>
+        <w:gridCol w:w="2262"/>
       </w:tblGrid>
       <w:tr>
         <w:trPr>
@@ -3103,19 +3088,19 @@
               <w:jc w:val="left"/>
             </w:pPr>
             <w:r>
-              <w:t xml:space="preserve">A manager must belong to the same company.</w:t>
-            </w:r>
-          </w:p>
-        </w:tc>
-        <w:tc>
-          <w:tcPr/>
-          <w:p>
-            <w:pPr>
-              <w:pStyle w:val="Compact"/>
-              <w:jc w:val="left"/>
-            </w:pPr>
-            <w:r>
-              <w:t xml:space="preserve">Partly built (core fields)</w:t>
+              <w:t xml:space="preserve">A manager must be active and belong to the same company; no one manages themselves; no management loops; at least one active HR admin remains; deactivation signs the person out.</w:t>
+            </w:r>
+          </w:p>
+        </w:tc>
+        <w:tc>
+          <w:tcPr/>
+          <w:p>
+            <w:pPr>
+              <w:pStyle w:val="Compact"/>
+              <w:jc w:val="left"/>
+            </w:pPr>
+            <w:r>
+              <w:t xml:space="preserve">Built (city-level jurisdiction pending)</w:t>
             </w:r>
           </w:p>
         </w:tc>
@@ -3173,7 +3158,7 @@
               <w:jc w:val="left"/>
             </w:pPr>
             <w:r>
-              <w:t xml:space="preserve">Pending</w:t>
+              <w:t xml:space="preserve">In progress (people); opening balances follow the plan engine</w:t>
             </w:r>
           </w:p>
         </w:tc>
@@ -3199,7 +3184,7 @@
               <w:jc w:val="left"/>
             </w:pPr>
             <w:r>
-              <w:t xml:space="preserve">Directory search by name, email, team, manager or location.</w:t>
+              <w:t xml:space="preserve">Directory search by name, email, team, manager, location or job title, with active, inactive or all.</w:t>
             </w:r>
           </w:p>
         </w:tc>
@@ -3231,7 +3216,7 @@
               <w:jc w:val="left"/>
             </w:pPr>
             <w:r>
-              <w:t xml:space="preserve">Pending</w:t>
+              <w:t xml:space="preserve">Built</w:t>
             </w:r>
           </w:p>
         </w:tc>
@@ -4674,6 +4659,59 @@
           </w:p>
         </w:tc>
       </w:tr>
+      <w:tr>
+        <w:tc>
+          <w:tcPr/>
+          <w:p>
+            <w:pPr>
+              <w:pStyle w:val="Compact"/>
+              <w:jc w:val="left"/>
+            </w:pPr>
+            <w:r>
+              <w:t xml:space="preserve">FR-64</w:t>
+            </w:r>
+          </w:p>
+        </w:tc>
+        <w:tc>
+          <w:tcPr/>
+          <w:p>
+            <w:pPr>
+              <w:pStyle w:val="Compact"/>
+              <w:jc w:val="left"/>
+            </w:pPr>
+            <w:r>
+              <w:t xml:space="preserve">Multiple time zones. Each person has a home time zone (default: company time zone). Requests are recorded against the requester’s home time zone: dates,</w:t>
+            </w:r>
+            <w:r>
+              <w:t xml:space="preserve"> </w:t>
+            </w:r>
+            <w:r>
+              <w:t xml:space="preserve">“</w:t>
+            </w:r>
+            <w:r>
+              <w:t xml:space="preserve">today</w:t>
+            </w:r>
+            <w:r>
+              <w:t xml:space="preserve">”</w:t>
+            </w:r>
+            <w:r>
+              <w:t xml:space="preserve">, past and future rules, half days, deadlines and escalations use it. Managers, HR and teammates see requests localized to their own zone, with the requester’s zone shown when it differs. Calendar entries, reminders and notifications go out in each recipient’s zone; reminders at a sensible local hour. Reports state the time zone in the run label.</w:t>
+            </w:r>
+          </w:p>
+        </w:tc>
+        <w:tc>
+          <w:tcPr/>
+          <w:p>
+            <w:pPr>
+              <w:pStyle w:val="Compact"/>
+              <w:jc w:val="left"/>
+            </w:pPr>
+            <w:r>
+              <w:t xml:space="preserve">S</w:t>
+            </w:r>
+          </w:p>
+        </w:tc>
+      </w:tr>
     </w:tbl>
     <w:bookmarkEnd w:id="33"/>
     <w:bookmarkStart w:id="34" w:name="reports-and-exports"/>
@@ -7155,20 +7193,25 @@
               <w:jc w:val="left"/>
             </w:pPr>
             <w:r>
-              <w:t xml:space="preserve">Part-time and non-standard work weeks: support in v1 (recommended, small) or backlog</w:t>
-            </w:r>
-          </w:p>
-        </w:tc>
-        <w:tc>
-          <w:tcPr/>
-          <w:p>
-            <w:pPr>
-              <w:pStyle w:val="Compact"/>
-              <w:jc w:val="left"/>
-            </w:pPr>
-            <w:r>
-              <w:t xml:space="preserve">People and accrual engine</w:t>
-            </w:r>
+              <w:rPr>
+                <w:strike/>
+              </w:rPr>
+              <w:t xml:space="preserve">Part-time and non-standard work weeks</w:t>
+            </w:r>
+            <w:r>
+              <w:t xml:space="preserve"> </w:t>
+            </w:r>
+            <w:r>
+              <w:t xml:space="preserve">Resolved: in v1 (work days and hours per day per person, built)</w:t>
+            </w:r>
+          </w:p>
+        </w:tc>
+        <w:tc>
+          <w:tcPr/>
+          <w:p>
+            <w:pPr>
+              <w:pStyle w:val="Compact"/>
+            </w:pPr>
           </w:p>
         </w:tc>
       </w:tr>
@@ -7193,20 +7236,25 @@
               <w:jc w:val="left"/>
             </w:pPr>
             <w:r>
-              <w:t xml:space="preserve">Company time zones: one per company (recommended) or per person</w:t>
-            </w:r>
-          </w:p>
-        </w:tc>
-        <w:tc>
-          <w:tcPr/>
-          <w:p>
-            <w:pPr>
-              <w:pStyle w:val="Compact"/>
-              <w:jc w:val="left"/>
-            </w:pPr>
-            <w:r>
-              <w:t xml:space="preserve">Accrual and year-end</w:t>
-            </w:r>
+              <w:rPr>
+                <w:strike/>
+              </w:rPr>
+              <w:t xml:space="preserve">Company time zones</w:t>
+            </w:r>
+            <w:r>
+              <w:t xml:space="preserve"> </w:t>
+            </w:r>
+            <w:r>
+              <w:t xml:space="preserve">Resolved: one per company in v1 (built); home time zone per person in v1.1 (FR-64)</w:t>
+            </w:r>
+          </w:p>
+        </w:tc>
+        <w:tc>
+          <w:tcPr/>
+          <w:p>
+            <w:pPr>
+              <w:pStyle w:val="Compact"/>
+            </w:pPr>
           </w:p>
         </w:tc>
       </w:tr>
@@ -7627,6 +7675,169 @@
       </w:tr>
     </w:tbl>
     <w:bookmarkEnd w:id="44"/>
+    <w:bookmarkStart w:id="45" w:name="change-log"/>
+    <w:p>
+      <w:pPr>
+        <w:pStyle w:val="Heading1"/>
+      </w:pPr>
+      <w:r>
+        <w:t xml:space="preserve">13. Change log</w:t>
+      </w:r>
+    </w:p>
+    <w:tbl>
+      <w:tblPr>
+        <w:tblStyle w:val="Table"/>
+        <w:tblW w:type="pct" w:w="5000"/>
+        <w:tblLook w:firstRow="1" w:lastRow="0" w:firstColumn="0" w:lastColumn="0" w:noHBand="0" w:noVBand="0" w:val="0020"/>
+        <w:jc w:val="start"/>
+        <w:tblBorders>
+          <w:top w:val="single" w:sz="4" w:color="B8C7D9"/>
+          <w:left w:val="single" w:sz="4" w:color="B8C7D9"/>
+          <w:bottom w:val="single" w:sz="4" w:color="B8C7D9"/>
+          <w:right w:val="single" w:sz="4" w:color="B8C7D9"/>
+          <w:insideH w:val="single" w:sz="4" w:color="B8C7D9"/>
+          <w:insideV w:val="single" w:sz="4" w:color="B8C7D9"/>
+        </w:tblBorders>
+      </w:tblPr>
+      <w:tblGrid>
+        <w:gridCol w:w="1320"/>
+        <w:gridCol w:w="1320"/>
+        <w:gridCol w:w="5280"/>
+      </w:tblGrid>
+      <w:tr>
+        <w:trPr>
+          <w:tblHeader w:val="true"/>
+        </w:trPr>
+        <w:tc>
+          <w:tcPr>
+            <w:shd w:val="clear" w:fill="E8EEF6"/>
+          </w:tcPr>
+          <w:p>
+            <w:pPr>
+              <w:pStyle w:val="Compact"/>
+              <w:jc w:val="left"/>
+            </w:pPr>
+            <w:r>
+              <w:rPr>
+                <w:b/>
+              </w:rPr>
+              <w:t xml:space="preserve">Version</w:t>
+            </w:r>
+          </w:p>
+        </w:tc>
+        <w:tc>
+          <w:tcPr>
+            <w:shd w:val="clear" w:fill="E8EEF6"/>
+          </w:tcPr>
+          <w:p>
+            <w:pPr>
+              <w:pStyle w:val="Compact"/>
+              <w:jc w:val="left"/>
+            </w:pPr>
+            <w:r>
+              <w:rPr>
+                <w:b/>
+              </w:rPr>
+              <w:t xml:space="preserve">Date</w:t>
+            </w:r>
+          </w:p>
+        </w:tc>
+        <w:tc>
+          <w:tcPr>
+            <w:shd w:val="clear" w:fill="E8EEF6"/>
+          </w:tcPr>
+          <w:p>
+            <w:pPr>
+              <w:pStyle w:val="Compact"/>
+              <w:jc w:val="left"/>
+            </w:pPr>
+            <w:r>
+              <w:rPr>
+                <w:b/>
+              </w:rPr>
+              <w:t xml:space="preserve">Changes</w:t>
+            </w:r>
+          </w:p>
+        </w:tc>
+      </w:tr>
+      <w:tr>
+        <w:tc>
+          <w:tcPr/>
+          <w:p>
+            <w:pPr>
+              <w:pStyle w:val="Compact"/>
+              <w:jc w:val="left"/>
+            </w:pPr>
+            <w:r>
+              <w:t xml:space="preserve">1.0</w:t>
+            </w:r>
+          </w:p>
+        </w:tc>
+        <w:tc>
+          <w:tcPr/>
+          <w:p>
+            <w:pPr>
+              <w:pStyle w:val="Compact"/>
+              <w:jc w:val="left"/>
+            </w:pPr>
+            <w:r>
+              <w:t xml:space="preserve">23 Oct 2026</w:t>
+            </w:r>
+          </w:p>
+        </w:tc>
+        <w:tc>
+          <w:tcPr/>
+          <w:p>
+            <w:pPr>
+              <w:pStyle w:val="Compact"/>
+              <w:jc w:val="left"/>
+            </w:pPr>
+            <w:r>
+              <w:t xml:space="preserve">First full scope.</w:t>
+            </w:r>
+          </w:p>
+        </w:tc>
+      </w:tr>
+      <w:tr>
+        <w:tc>
+          <w:tcPr/>
+          <w:p>
+            <w:pPr>
+              <w:pStyle w:val="Compact"/>
+              <w:jc w:val="left"/>
+            </w:pPr>
+            <w:r>
+              <w:t xml:space="preserve">1.1</w:t>
+            </w:r>
+          </w:p>
+        </w:tc>
+        <w:tc>
+          <w:tcPr/>
+          <w:p>
+            <w:pPr>
+              <w:pStyle w:val="Compact"/>
+              <w:jc w:val="left"/>
+            </w:pPr>
+            <w:r>
+              <w:t xml:space="preserve">23 Oct 2026</w:t>
+            </w:r>
+          </w:p>
+        </w:tc>
+        <w:tc>
+          <w:tcPr/>
+          <w:p>
+            <w:pPr>
+              <w:pStyle w:val="Compact"/>
+              <w:jc w:val="left"/>
+            </w:pPr>
+            <w:r>
+              <w:t xml:space="preserve">D3 and D4 resolved (part-time work weeks and company time zone in v1, both built). FR-06, FR-20 and FR-22 built. FR-21 in progress. Added FR-64, multiple time zones, to v1.1. These documents are now updated after each merged feature.</w:t>
+            </w:r>
+          </w:p>
+        </w:tc>
+      </w:tr>
+    </w:tbl>
+    <w:bookmarkEnd w:id="45"/>
     <w:sectPr/>
   </w:body>
 </w:document>

</xml_diff>

<commit_message>
PRD/TRD v1.2 (bulk import built) and model delegation policy
- CLAUDE.md: delegate low-complexity work to lower models (Haiku for docs
  and status, Sonnet for standard features), review every result, ask
  the owner before escalating to a higher model
- PRD/TRD v1.2: FR-21 people import built; migration 005; delegation
  rule in the delivery process; Word/PDF rebuilt
  (documentation edits made by a Haiku subagent, reviewed here)

Co-Authored-By: Claude Opus 5.5 <noreply@anthropic.com>
Claude-Session: https://claude.ai/code/session_01HeJF1Y197Q7LrJLGGjCvL1
</commit_message>
<xml_diff>
--- a/docs/files/AAS_Time_Off_Planner_PRD.docx
+++ b/docs/files/AAS_Time_Off_Planner_PRD.docx
@@ -57,7 +57,7 @@
         <w:t xml:space="preserve"> </w:t>
       </w:r>
       <w:r>
-        <w:t xml:space="preserve">1.1</w:t>
+        <w:t xml:space="preserve">1.2</w:t>
       </w:r>
     </w:p>
     <w:p>
@@ -220,7 +220,7 @@
               <w:jc w:val="left"/>
             </w:pPr>
             <w:r>
-              <w:t xml:space="preserve">1.1 (see change log, section 13)</w:t>
+              <w:t xml:space="preserve">1.2 (see change log, section 13)</w:t>
             </w:r>
           </w:p>
         </w:tc>
@@ -371,7 +371,7 @@
               <w:t xml:space="preserve">main</w:t>
             </w:r>
             <w:r>
-              <w:t xml:space="preserve">: company setup, company data separation, short labels, email sign-in, two-step sign-in, people management, company settings</w:t>
+              <w:t xml:space="preserve">: company setup, company data separation, short labels, email sign-in, two-step sign-in, people management, company settings, bulk import of people</w:t>
             </w:r>
           </w:p>
         </w:tc>
@@ -3158,7 +3158,7 @@
               <w:jc w:val="left"/>
             </w:pPr>
             <w:r>
-              <w:t xml:space="preserve">In progress (people); opening balances follow the plan engine</w:t>
+              <w:t xml:space="preserve">Built for people (CSV or XLSX, preview with row-level problems, matched by email, all-or-nothing); opening balances follow the plan engine</w:t>
             </w:r>
           </w:p>
         </w:tc>
@@ -7832,6 +7832,44 @@
             </w:pPr>
             <w:r>
               <w:t xml:space="preserve">D3 and D4 resolved (part-time work weeks and company time zone in v1, both built). FR-06, FR-20 and FR-22 built. FR-21 in progress. Added FR-64, multiple time zones, to v1.1. These documents are now updated after each merged feature.</w:t>
+            </w:r>
+          </w:p>
+        </w:tc>
+      </w:tr>
+      <w:tr>
+        <w:tc>
+          <w:tcPr/>
+          <w:p>
+            <w:pPr>
+              <w:pStyle w:val="Compact"/>
+              <w:jc w:val="left"/>
+            </w:pPr>
+            <w:r>
+              <w:t xml:space="preserve">1.2</w:t>
+            </w:r>
+          </w:p>
+        </w:tc>
+        <w:tc>
+          <w:tcPr/>
+          <w:p>
+            <w:pPr>
+              <w:pStyle w:val="Compact"/>
+              <w:jc w:val="left"/>
+            </w:pPr>
+            <w:r>
+              <w:t xml:space="preserve">23 Oct 2026</w:t>
+            </w:r>
+          </w:p>
+        </w:tc>
+        <w:tc>
+          <w:tcPr/>
+          <w:p>
+            <w:pPr>
+              <w:pStyle w:val="Compact"/>
+              <w:jc w:val="left"/>
+            </w:pPr>
+            <w:r>
+              <w:t xml:space="preserve">FR-21 bulk import of people built (opening balances follow the plan engine). Added the model delegation rule: simpler work goes to lower AI models and is reviewed; the owner is asked before escalating to a higher model.</w:t>
             </w:r>
           </w:p>
         </w:tc>

</xml_diff>

<commit_message>
PRD and TRD v1.3: plans, accrual engine and balances
PRD: status for FR-30 to FR-42, new FR-43 (plan settings lock once
balances exist), backlog additions (persona demo videos, guided in-app
help, French interface for Quebec as a future item), D7 note.
TRD: migration 006 tables, section 8 rewritten for the built engine,
testing, known limitations and traceability. Word and PDF rebuilt.

Co-Authored-By: Claude Opus 5.5 <noreply@anthropic.com>
Claude-Session: https://claude.ai/code/session_01HeJF1Y197Q7LrJLGGjCvL1
</commit_message>
<xml_diff>
--- a/docs/files/AAS_Time_Off_Planner_PRD.docx
+++ b/docs/files/AAS_Time_Off_Planner_PRD.docx
@@ -57,7 +57,7 @@
         <w:t xml:space="preserve"> </w:t>
       </w:r>
       <w:r>
-        <w:t xml:space="preserve">1.2</w:t>
+        <w:t xml:space="preserve">1.3</w:t>
       </w:r>
     </w:p>
     <w:p>
@@ -220,7 +220,7 @@
               <w:jc w:val="left"/>
             </w:pPr>
             <w:r>
-              <w:t xml:space="preserve">1.2 (see change log, section 13)</w:t>
+              <w:t xml:space="preserve">1.3 (see change log, section 13)</w:t>
             </w:r>
           </w:p>
         </w:tc>
@@ -298,7 +298,7 @@
               <w:jc w:val="left"/>
             </w:pPr>
             <w:r>
-              <w:t xml:space="preserve">Technical Requirements Document (TRD) v1.0</w:t>
+              <w:t xml:space="preserve">Technical Requirements Document (TRD) v1.3</w:t>
             </w:r>
           </w:p>
         </w:tc>
@@ -371,7 +371,7 @@
               <w:t xml:space="preserve">main</w:t>
             </w:r>
             <w:r>
-              <w:t xml:space="preserve">: company setup, company data separation, short labels, email sign-in, two-step sign-in, people management, company settings, bulk import of people</w:t>
+              <w:t xml:space="preserve">: company setup, company data separation, short labels, email sign-in, two-step sign-in, people management, company settings, bulk import of people, time off plans with levels and assignments, accrual engine and balances</w:t>
             </w:r>
           </w:p>
         </w:tc>
@@ -1741,7 +1741,7 @@
               <w:jc w:val="left"/>
             </w:pPr>
             <w:r>
-              <w:t xml:space="preserve">Salary data and dollar liability; finance role; hourly employees and overtime; Google Sheets export; blackout periods; maximum off per team; hourly requests; mobile apps; dedicated database per company; Jira Forge app; MCP server for AI assistants</w:t>
+              <w:t xml:space="preserve">Salary data and dollar liability; finance role; hourly employees and overtime; Google Sheets export; blackout periods; maximum off per team; hourly requests; mobile apps; dedicated database per company; Jira Forge app; MCP server for AI assistants; demo videos for each persona with English captions; guided in-app help for each persona with an on/off preference; French interface for Quebec (future item, only if a company hires someone working in Quebec)</w:t>
             </w:r>
           </w:p>
         </w:tc>
@@ -3248,10 +3248,11 @@
         </w:tblBorders>
       </w:tblPr>
       <w:tblGrid>
-        <w:gridCol w:w="826"/>
-        <w:gridCol w:w="3305"/>
-        <w:gridCol w:w="826"/>
-        <w:gridCol w:w="2961"/>
+        <w:gridCol w:w="565"/>
+        <w:gridCol w:w="2262"/>
+        <w:gridCol w:w="565"/>
+        <w:gridCol w:w="2262"/>
+        <w:gridCol w:w="2262"/>
       </w:tblGrid>
       <w:tr>
         <w:trPr>
@@ -3325,6 +3326,23 @@
             </w:r>
           </w:p>
         </w:tc>
+        <w:tc>
+          <w:tcPr>
+            <w:shd w:val="clear" w:fill="E8EEF6"/>
+          </w:tcPr>
+          <w:p>
+            <w:pPr>
+              <w:pStyle w:val="Compact"/>
+              <w:jc w:val="left"/>
+            </w:pPr>
+            <w:r>
+              <w:rPr>
+                <w:b/>
+              </w:rPr>
+              <w:t xml:space="preserve">Status</w:t>
+            </w:r>
+          </w:p>
+        </w:tc>
       </w:tr>
       <w:tr>
         <w:tc>
@@ -3371,6 +3389,18 @@
             </w:pPr>
           </w:p>
         </w:tc>
+        <w:tc>
+          <w:tcPr/>
+          <w:p>
+            <w:pPr>
+              <w:pStyle w:val="Compact"/>
+              <w:jc w:val="left"/>
+            </w:pPr>
+            <w:r>
+              <w:t xml:space="preserve">Built (starter templates: Vacation, Wellbeing, Sick, Personal, Unpaid; all nine categories available)</w:t>
+            </w:r>
+          </w:p>
+        </w:tc>
       </w:tr>
       <w:tr>
         <w:tc>
@@ -3417,6 +3447,18 @@
             </w:pPr>
           </w:p>
         </w:tc>
+        <w:tc>
+          <w:tcPr/>
+          <w:p>
+            <w:pPr>
+              <w:pStyle w:val="Compact"/>
+              <w:jc w:val="left"/>
+            </w:pPr>
+            <w:r>
+              <w:t xml:space="preserve">Built</w:t>
+            </w:r>
+          </w:p>
+        </w:tc>
       </w:tr>
       <w:tr>
         <w:tc>
@@ -3463,6 +3505,18 @@
             </w:pPr>
           </w:p>
         </w:tc>
+        <w:tc>
+          <w:tcPr/>
+          <w:p>
+            <w:pPr>
+              <w:pStyle w:val="Compact"/>
+              <w:jc w:val="left"/>
+            </w:pPr>
+            <w:r>
+              <w:t xml:space="preserve">Built (day 1 to 28 of any month)</w:t>
+            </w:r>
+          </w:p>
+        </w:tc>
       </w:tr>
       <w:tr>
         <w:tc>
@@ -3509,6 +3563,18 @@
             </w:pPr>
           </w:p>
         </w:tc>
+        <w:tc>
+          <w:tcPr/>
+          <w:p>
+            <w:pPr>
+              <w:pStyle w:val="Compact"/>
+              <w:jc w:val="left"/>
+            </w:pPr>
+            <w:r>
+              <w:t xml:space="preserve">Partly built (days or hours per plan; deduction comes with requests)</w:t>
+            </w:r>
+          </w:p>
+        </w:tc>
       </w:tr>
       <w:tr>
         <w:tc>
@@ -3555,6 +3621,18 @@
             </w:pPr>
           </w:p>
         </w:tc>
+        <w:tc>
+          <w:tcPr/>
+          <w:p>
+            <w:pPr>
+              <w:pStyle w:val="Compact"/>
+              <w:jc w:val="left"/>
+            </w:pPr>
+            <w:r>
+              <w:t xml:space="preserve">Built except manual grants (ledger supports adjustments; screen pending)</w:t>
+            </w:r>
+          </w:p>
+        </w:tc>
       </w:tr>
       <w:tr>
         <w:tc>
@@ -3605,6 +3683,18 @@
             </w:r>
           </w:p>
         </w:tc>
+        <w:tc>
+          <w:tcPr/>
+          <w:p>
+            <w:pPr>
+              <w:pStyle w:val="Compact"/>
+              <w:jc w:val="left"/>
+            </w:pPr>
+            <w:r>
+              <w:t xml:space="preserve">Built</w:t>
+            </w:r>
+          </w:p>
+        </w:tc>
       </w:tr>
       <w:tr>
         <w:tc>
@@ -3651,6 +3741,18 @@
             </w:pPr>
           </w:p>
         </w:tc>
+        <w:tc>
+          <w:tcPr/>
+          <w:p>
+            <w:pPr>
+              <w:pStyle w:val="Compact"/>
+              <w:jc w:val="left"/>
+            </w:pPr>
+            <w:r>
+              <w:t xml:space="preserve">Built (payout flag stored; payout report pending)</w:t>
+            </w:r>
+          </w:p>
+        </w:tc>
       </w:tr>
       <w:tr>
         <w:tc>
@@ -3697,6 +3799,18 @@
             </w:pPr>
           </w:p>
         </w:tc>
+        <w:tc>
+          <w:tcPr/>
+          <w:p>
+            <w:pPr>
+              <w:pStyle w:val="Compact"/>
+              <w:jc w:val="left"/>
+            </w:pPr>
+            <w:r>
+              <w:t xml:space="preserve">Built in the engine (overrides are ledger rows naming the rule); year-end preview pending</w:t>
+            </w:r>
+          </w:p>
+        </w:tc>
       </w:tr>
       <w:tr>
         <w:tc>
@@ -3743,6 +3857,18 @@
             </w:pPr>
           </w:p>
         </w:tc>
+        <w:tc>
+          <w:tcPr/>
+          <w:p>
+            <w:pPr>
+              <w:pStyle w:val="Compact"/>
+              <w:jc w:val="left"/>
+            </w:pPr>
+            <w:r>
+              <w:t xml:space="preserve">Partly built (table seeded, marked unverified pending legal review; warnings on the admin’s person page; plan-save warning and compliance report pending)</w:t>
+            </w:r>
+          </w:p>
+        </w:tc>
       </w:tr>
       <w:tr>
         <w:tc>
@@ -3789,6 +3915,18 @@
             </w:pPr>
           </w:p>
         </w:tc>
+        <w:tc>
+          <w:tcPr/>
+          <w:p>
+            <w:pPr>
+              <w:pStyle w:val="Compact"/>
+              <w:jc w:val="left"/>
+            </w:pPr>
+            <w:r>
+              <w:t xml:space="preserve">Built</w:t>
+            </w:r>
+          </w:p>
+        </w:tc>
       </w:tr>
       <w:tr>
         <w:tc>
@@ -3835,6 +3973,18 @@
             </w:pPr>
           </w:p>
         </w:tc>
+        <w:tc>
+          <w:tcPr/>
+          <w:p>
+            <w:pPr>
+              <w:pStyle w:val="Compact"/>
+              <w:jc w:val="left"/>
+            </w:pPr>
+            <w:r>
+              <w:t xml:space="preserve">Stored; enforced when requests are built</w:t>
+            </w:r>
+          </w:p>
+        </w:tc>
       </w:tr>
       <w:tr>
         <w:tc>
@@ -3881,6 +4031,18 @@
             </w:pPr>
           </w:p>
         </w:tc>
+        <w:tc>
+          <w:tcPr/>
+          <w:p>
+            <w:pPr>
+              <w:pStyle w:val="Compact"/>
+              <w:jc w:val="left"/>
+            </w:pPr>
+            <w:r>
+              <w:t xml:space="preserve">Pending</w:t>
+            </w:r>
+          </w:p>
+        </w:tc>
       </w:tr>
       <w:tr>
         <w:tc>
@@ -3925,6 +4087,80 @@
             <w:pPr>
               <w:pStyle w:val="Compact"/>
             </w:pPr>
+          </w:p>
+        </w:tc>
+        <w:tc>
+          <w:tcPr/>
+          <w:p>
+            <w:pPr>
+              <w:pStyle w:val="Compact"/>
+              <w:jc w:val="left"/>
+            </w:pPr>
+            <w:r>
+              <w:t xml:space="preserve">Partly built (projection to plan year end; any future date pending)</w:t>
+            </w:r>
+          </w:p>
+        </w:tc>
+      </w:tr>
+      <w:tr>
+        <w:tc>
+          <w:tcPr/>
+          <w:p>
+            <w:pPr>
+              <w:pStyle w:val="Compact"/>
+              <w:jc w:val="left"/>
+            </w:pPr>
+            <w:r>
+              <w:t xml:space="preserve">FR-43</w:t>
+            </w:r>
+          </w:p>
+        </w:tc>
+        <w:tc>
+          <w:tcPr/>
+          <w:p>
+            <w:pPr>
+              <w:pStyle w:val="Compact"/>
+              <w:jc w:val="left"/>
+            </w:pPr>
+            <w:r>
+              <w:t xml:space="preserve">A plan’s unit, earning method, plan year start, lump sum timing and frequency cannot change once the plan has balances; the admin creates a new plan instead.</w:t>
+            </w:r>
+          </w:p>
+        </w:tc>
+        <w:tc>
+          <w:tcPr/>
+          <w:p>
+            <w:pPr>
+              <w:pStyle w:val="Compact"/>
+              <w:jc w:val="left"/>
+            </w:pPr>
+            <w:r>
+              <w:t xml:space="preserve">M</w:t>
+            </w:r>
+          </w:p>
+        </w:tc>
+        <w:tc>
+          <w:tcPr/>
+          <w:p>
+            <w:pPr>
+              <w:pStyle w:val="Compact"/>
+              <w:jc w:val="left"/>
+            </w:pPr>
+            <w:r>
+              <w:t xml:space="preserve">Saving such a change shows a message on the field.</w:t>
+            </w:r>
+          </w:p>
+        </w:tc>
+        <w:tc>
+          <w:tcPr/>
+          <w:p>
+            <w:pPr>
+              <w:pStyle w:val="Compact"/>
+              <w:jc w:val="left"/>
+            </w:pPr>
+            <w:r>
+              <w:t xml:space="preserve">Built</w:t>
+            </w:r>
           </w:p>
         </w:tc>
       </w:tr>
@@ -7036,9 +7272,9 @@
         </w:tblBorders>
       </w:tblPr>
       <w:tblGrid>
-        <w:gridCol w:w="1080"/>
-        <w:gridCol w:w="4320"/>
-        <w:gridCol w:w="2520"/>
+        <w:gridCol w:w="880"/>
+        <w:gridCol w:w="3520"/>
+        <w:gridCol w:w="3520"/>
       </w:tblGrid>
       <w:tr>
         <w:trPr>
@@ -7367,7 +7603,7 @@
               <w:jc w:val="left"/>
             </w:pPr>
             <w:r>
-              <w:t xml:space="preserve">Before release</w:t>
+              <w:t xml:space="preserve">Before release (statutory figures are in the app, marked unverified)</w:t>
             </w:r>
           </w:p>
         </w:tc>
@@ -7870,6 +8106,44 @@
             </w:pPr>
             <w:r>
               <w:t xml:space="preserve">FR-21 bulk import of people built (opening balances follow the plan engine). Added the model delegation rule: simpler work goes to lower AI models and is reviewed; the owner is asked before escalating to a higher model.</w:t>
+            </w:r>
+          </w:p>
+        </w:tc>
+      </w:tr>
+      <w:tr>
+        <w:tc>
+          <w:tcPr/>
+          <w:p>
+            <w:pPr>
+              <w:pStyle w:val="Compact"/>
+              <w:jc w:val="left"/>
+            </w:pPr>
+            <w:r>
+              <w:t xml:space="preserve">1.3</w:t>
+            </w:r>
+          </w:p>
+        </w:tc>
+        <w:tc>
+          <w:tcPr/>
+          <w:p>
+            <w:pPr>
+              <w:pStyle w:val="Compact"/>
+              <w:jc w:val="left"/>
+            </w:pPr>
+            <w:r>
+              <w:t xml:space="preserve">23 Oct 2026</w:t>
+            </w:r>
+          </w:p>
+        </w:tc>
+        <w:tc>
+          <w:tcPr/>
+          <w:p>
+            <w:pPr>
+              <w:pStyle w:val="Compact"/>
+              <w:jc w:val="left"/>
+            </w:pPr>
+            <w:r>
+              <w:t xml:space="preserve">FR-30 to FR-42 status added: plans, levels, assignments, accrual engine, year-end carryover and expiry, jurisdiction overrides and balances built. Added FR-43 (plan settings lock once balances exist). Backlog: persona demo videos with captions, guided in-app help, French interface for Quebec as a future item (no Quebec companies or staff today).</w:t>
             </w:r>
           </w:p>
         </w:tc>

</xml_diff>

<commit_message>
PRD and TRD v1.4: requests, approvals, holidays, calendar, reports
PRD: status for FR-33, FR-34, FR-40, FR-41, FR-50 to FR-57, FR-60 to
FR-64, FR-70 to FR-80 and FR-100; new FR-101 (reminders of upcoming
time off); D10 (defaults chosen during the build, to confirm).
TRD: migrations 007 to 011, sections 9, 10 and 12 rewritten for what
is built, security controls, known limitations, T2 resolved,
traceability. Word and PDF rebuilt.

Co-Authored-By: Claude Opus 5.5 <noreply@anthropic.com>
Claude-Session: https://claude.ai/code/session_01HeJF1Y197Q7LrJLGGjCvL1
</commit_message>
<xml_diff>
--- a/docs/files/AAS_Time_Off_Planner_PRD.docx
+++ b/docs/files/AAS_Time_Off_Planner_PRD.docx
@@ -57,7 +57,7 @@
         <w:t xml:space="preserve"> </w:t>
       </w:r>
       <w:r>
-        <w:t xml:space="preserve">1.3</w:t>
+        <w:t xml:space="preserve">1.4</w:t>
       </w:r>
     </w:p>
     <w:p>
@@ -220,7 +220,7 @@
               <w:jc w:val="left"/>
             </w:pPr>
             <w:r>
-              <w:t xml:space="preserve">1.3 (see change log, section 13)</w:t>
+              <w:t xml:space="preserve">1.4 (see change log, section 13)</w:t>
             </w:r>
           </w:p>
         </w:tc>
@@ -298,7 +298,7 @@
               <w:jc w:val="left"/>
             </w:pPr>
             <w:r>
-              <w:t xml:space="preserve">Technical Requirements Document (TRD) v1.3</w:t>
+              <w:t xml:space="preserve">Technical Requirements Document (TRD) v1.4</w:t>
             </w:r>
           </w:p>
         </w:tc>
@@ -371,7 +371,7 @@
               <w:t xml:space="preserve">main</w:t>
             </w:r>
             <w:r>
-              <w:t xml:space="preserve">: company setup, company data separation, short labels, email sign-in, two-step sign-in, people management, company settings, bulk import of people, time off plans with levels and assignments, accrual engine and balances</w:t>
+              <w:t xml:space="preserve">: company setup, company data separation, short labels, email sign-in, two-step sign-in, people management, company settings, bulk import of people, time off plans with levels and assignments, accrual engine and balances, requests and approvals with reminders and backup approvers, public holidays, team calendar and calendar feed links (in review), reports with Excel and CSV export (in review)</w:t>
             </w:r>
           </w:p>
         </w:tc>
@@ -3571,7 +3571,7 @@
               <w:jc w:val="left"/>
             </w:pPr>
             <w:r>
-              <w:t xml:space="preserve">Partly built (days or hours per plan; deduction comes with requests)</w:t>
+              <w:t xml:space="preserve">Built (hours plans deduct the person’s standard hours per day)</w:t>
             </w:r>
           </w:p>
         </w:tc>
@@ -3629,7 +3629,7 @@
               <w:jc w:val="left"/>
             </w:pPr>
             <w:r>
-              <w:t xml:space="preserve">Built except manual grants (ledger supports adjustments; screen pending)</w:t>
+              <w:t xml:space="preserve">Built (manual grants are balance adjustments, FR-57)</w:t>
             </w:r>
           </w:p>
         </w:tc>
@@ -3981,7 +3981,7 @@
               <w:jc w:val="left"/>
             </w:pPr>
             <w:r>
-              <w:t xml:space="preserve">Stored; enforced when requests are built</w:t>
+              <w:t xml:space="preserve">Built (enforced on every request)</w:t>
             </w:r>
           </w:p>
         </w:tc>
@@ -4039,7 +4039,7 @@
               <w:jc w:val="left"/>
             </w:pPr>
             <w:r>
-              <w:t xml:space="preserve">Pending</w:t>
+              <w:t xml:space="preserve">Built (all provinces and territories, US federal list, company holidays; marked unverified pending legal review)</w:t>
             </w:r>
           </w:p>
         </w:tc>
@@ -4191,10 +4191,11 @@
         </w:tblBorders>
       </w:tblPr>
       <w:tblGrid>
-        <w:gridCol w:w="792"/>
-        <w:gridCol w:w="3168"/>
-        <w:gridCol w:w="792"/>
-        <w:gridCol w:w="3168"/>
+        <w:gridCol w:w="565"/>
+        <w:gridCol w:w="2262"/>
+        <w:gridCol w:w="565"/>
+        <w:gridCol w:w="2262"/>
+        <w:gridCol w:w="2262"/>
       </w:tblGrid>
       <w:tr>
         <w:trPr>
@@ -4268,6 +4269,23 @@
             </w:r>
           </w:p>
         </w:tc>
+        <w:tc>
+          <w:tcPr>
+            <w:shd w:val="clear" w:fill="E8EEF6"/>
+          </w:tcPr>
+          <w:p>
+            <w:pPr>
+              <w:pStyle w:val="Compact"/>
+              <w:jc w:val="left"/>
+            </w:pPr>
+            <w:r>
+              <w:rPr>
+                <w:b/>
+              </w:rPr>
+              <w:t xml:space="preserve">Status</w:t>
+            </w:r>
+          </w:p>
+        </w:tc>
       </w:tr>
       <w:tr>
         <w:tc>
@@ -4314,6 +4332,18 @@
             </w:pPr>
           </w:p>
         </w:tc>
+        <w:tc>
+          <w:tcPr/>
+          <w:p>
+            <w:pPr>
+              <w:pStyle w:val="Compact"/>
+              <w:jc w:val="left"/>
+            </w:pPr>
+            <w:r>
+              <w:t xml:space="preserve">Built (overlaps are blocked rather than warned)</w:t>
+            </w:r>
+          </w:p>
+        </w:tc>
       </w:tr>
       <w:tr>
         <w:tc>
@@ -4360,6 +4390,18 @@
             </w:pPr>
           </w:p>
         </w:tc>
+        <w:tc>
+          <w:tcPr/>
+          <w:p>
+            <w:pPr>
+              <w:pStyle w:val="Compact"/>
+              <w:jc w:val="left"/>
+            </w:pPr>
+            <w:r>
+              <w:t xml:space="preserve">Built</w:t>
+            </w:r>
+          </w:p>
+        </w:tc>
       </w:tr>
       <w:tr>
         <w:tc>
@@ -4410,6 +4452,18 @@
             </w:r>
           </w:p>
         </w:tc>
+        <w:tc>
+          <w:tcPr/>
+          <w:p>
+            <w:pPr>
+              <w:pStyle w:val="Compact"/>
+              <w:jc w:val="left"/>
+            </w:pPr>
+            <w:r>
+              <w:t xml:space="preserve">Built (automatic and HR-approved plans have no second step)</w:t>
+            </w:r>
+          </w:p>
+        </w:tc>
       </w:tr>
       <w:tr>
         <w:tc>
@@ -4456,6 +4510,18 @@
             </w:pPr>
           </w:p>
         </w:tc>
+        <w:tc>
+          <w:tcPr/>
+          <w:p>
+            <w:pPr>
+              <w:pStyle w:val="Compact"/>
+              <w:jc w:val="left"/>
+            </w:pPr>
+            <w:r>
+              <w:t xml:space="preserve">Built</w:t>
+            </w:r>
+          </w:p>
+        </w:tc>
       </w:tr>
       <w:tr>
         <w:tc>
@@ -4502,6 +4568,18 @@
             </w:pPr>
           </w:p>
         </w:tc>
+        <w:tc>
+          <w:tcPr/>
+          <w:p>
+            <w:pPr>
+              <w:pStyle w:val="Compact"/>
+              <w:jc w:val="left"/>
+            </w:pPr>
+            <w:r>
+              <w:t xml:space="preserve">Built (per-plan setting, on by default)</w:t>
+            </w:r>
+          </w:p>
+        </w:tc>
       </w:tr>
       <w:tr>
         <w:tc>
@@ -4548,6 +4626,18 @@
             </w:pPr>
           </w:p>
         </w:tc>
+        <w:tc>
+          <w:tcPr/>
+          <w:p>
+            <w:pPr>
+              <w:pStyle w:val="Compact"/>
+              <w:jc w:val="left"/>
+            </w:pPr>
+            <w:r>
+              <w:t xml:space="preserve">Built (reminder after 2 business days, HR told after 5, both set per company)</w:t>
+            </w:r>
+          </w:p>
+        </w:tc>
       </w:tr>
       <w:tr>
         <w:tc>
@@ -4594,6 +4684,18 @@
             </w:pPr>
           </w:p>
         </w:tc>
+        <w:tc>
+          <w:tcPr/>
+          <w:p>
+            <w:pPr>
+              <w:pStyle w:val="Compact"/>
+              <w:jc w:val="left"/>
+            </w:pPr>
+            <w:r>
+              <w:t xml:space="preserve">Partly built (HR can add time off for anyone; editing someone’s existing request from their page is pending)</w:t>
+            </w:r>
+          </w:p>
+        </w:tc>
       </w:tr>
       <w:tr>
         <w:tc>
@@ -4638,6 +4740,18 @@
             <w:pPr>
               <w:pStyle w:val="Compact"/>
             </w:pPr>
+          </w:p>
+        </w:tc>
+        <w:tc>
+          <w:tcPr/>
+          <w:p>
+            <w:pPr>
+              <w:pStyle w:val="Compact"/>
+              <w:jc w:val="left"/>
+            </w:pPr>
+            <w:r>
+              <w:t xml:space="preserve">Built</w:t>
+            </w:r>
           </w:p>
         </w:tc>
       </w:tr>
@@ -4668,9 +4782,10 @@
         </w:tblBorders>
       </w:tblPr>
       <w:tblGrid>
-        <w:gridCol w:w="1320"/>
-        <w:gridCol w:w="5280"/>
-        <w:gridCol w:w="1320"/>
+        <w:gridCol w:w="792"/>
+        <w:gridCol w:w="3168"/>
+        <w:gridCol w:w="792"/>
+        <w:gridCol w:w="3168"/>
       </w:tblGrid>
       <w:tr>
         <w:trPr>
@@ -4727,6 +4842,23 @@
             </w:r>
           </w:p>
         </w:tc>
+        <w:tc>
+          <w:tcPr>
+            <w:shd w:val="clear" w:fill="E8EEF6"/>
+          </w:tcPr>
+          <w:p>
+            <w:pPr>
+              <w:pStyle w:val="Compact"/>
+              <w:jc w:val="left"/>
+            </w:pPr>
+            <w:r>
+              <w:rPr>
+                <w:b/>
+              </w:rPr>
+              <w:t xml:space="preserve">Status</w:t>
+            </w:r>
+          </w:p>
+        </w:tc>
       </w:tr>
       <w:tr>
         <w:tc>
@@ -4780,6 +4912,18 @@
             </w:r>
           </w:p>
         </w:tc>
+        <w:tc>
+          <w:tcPr/>
+          <w:p>
+            <w:pPr>
+              <w:pStyle w:val="Compact"/>
+              <w:jc w:val="left"/>
+            </w:pPr>
+            <w:r>
+              <w:t xml:space="preserve">Built, in review (week grid of 2 to 6 weeks; a month view is pending)</w:t>
+            </w:r>
+          </w:p>
+        </w:tc>
       </w:tr>
       <w:tr>
         <w:tc>
@@ -4818,6 +4962,18 @@
             </w:r>
           </w:p>
         </w:tc>
+        <w:tc>
+          <w:tcPr/>
+          <w:p>
+            <w:pPr>
+              <w:pStyle w:val="Compact"/>
+              <w:jc w:val="left"/>
+            </w:pPr>
+            <w:r>
+              <w:t xml:space="preserve">Built, in review (my time off, my team, people I manage)</w:t>
+            </w:r>
+          </w:p>
+        </w:tc>
       </w:tr>
       <w:tr>
         <w:tc>
@@ -4856,6 +5012,18 @@
             </w:r>
           </w:p>
         </w:tc>
+        <w:tc>
+          <w:tcPr/>
+          <w:p>
+            <w:pPr>
+              <w:pStyle w:val="Compact"/>
+              <w:jc w:val="left"/>
+            </w:pPr>
+            <w:r>
+              <w:t xml:space="preserve">Planned (v1.1)</w:t>
+            </w:r>
+          </w:p>
+        </w:tc>
       </w:tr>
       <w:tr>
         <w:tc>
@@ -4894,6 +5062,18 @@
             </w:r>
           </w:p>
         </w:tc>
+        <w:tc>
+          <w:tcPr/>
+          <w:p>
+            <w:pPr>
+              <w:pStyle w:val="Compact"/>
+              <w:jc w:val="left"/>
+            </w:pPr>
+            <w:r>
+              <w:t xml:space="preserve">Planned (v1.1)</w:t>
+            </w:r>
+          </w:p>
+        </w:tc>
       </w:tr>
       <w:tr>
         <w:tc>
@@ -4944,6 +5124,18 @@
             </w:pPr>
             <w:r>
               <w:t xml:space="preserve">S</w:t>
+            </w:r>
+          </w:p>
+        </w:tc>
+        <w:tc>
+          <w:tcPr/>
+          <w:p>
+            <w:pPr>
+              <w:pStyle w:val="Compact"/>
+              <w:jc w:val="left"/>
+            </w:pPr>
+            <w:r>
+              <w:t xml:space="preserve">Planned (v1.1)</w:t>
             </w:r>
           </w:p>
         </w:tc>
@@ -5004,9 +5196,10 @@
         </w:tblBorders>
       </w:tblPr>
       <w:tblGrid>
-        <w:gridCol w:w="1320"/>
-        <w:gridCol w:w="5280"/>
-        <w:gridCol w:w="1320"/>
+        <w:gridCol w:w="1080"/>
+        <w:gridCol w:w="4320"/>
+        <w:gridCol w:w="1080"/>
+        <w:gridCol w:w="1440"/>
       </w:tblGrid>
       <w:tr>
         <w:trPr>
@@ -5063,6 +5256,23 @@
             </w:r>
           </w:p>
         </w:tc>
+        <w:tc>
+          <w:tcPr>
+            <w:shd w:val="clear" w:fill="E8EEF6"/>
+          </w:tcPr>
+          <w:p>
+            <w:pPr>
+              <w:pStyle w:val="Compact"/>
+              <w:jc w:val="left"/>
+            </w:pPr>
+            <w:r>
+              <w:rPr>
+                <w:b/>
+              </w:rPr>
+              <w:t xml:space="preserve">Status</w:t>
+            </w:r>
+          </w:p>
+        </w:tc>
       </w:tr>
       <w:tr>
         <w:tc>
@@ -5101,6 +5311,18 @@
             </w:r>
           </w:p>
         </w:tc>
+        <w:tc>
+          <w:tcPr/>
+          <w:p>
+            <w:pPr>
+              <w:pStyle w:val="Compact"/>
+              <w:jc w:val="left"/>
+            </w:pPr>
+            <w:r>
+              <w:t xml:space="preserve">Built, in review</w:t>
+            </w:r>
+          </w:p>
+        </w:tc>
       </w:tr>
       <w:tr>
         <w:tc>
@@ -5139,6 +5361,18 @@
             </w:r>
           </w:p>
         </w:tc>
+        <w:tc>
+          <w:tcPr/>
+          <w:p>
+            <w:pPr>
+              <w:pStyle w:val="Compact"/>
+              <w:jc w:val="left"/>
+            </w:pPr>
+            <w:r>
+              <w:t xml:space="preserve">Built, in review</w:t>
+            </w:r>
+          </w:p>
+        </w:tc>
       </w:tr>
       <w:tr>
         <w:tc>
@@ -5177,6 +5411,18 @@
             </w:r>
           </w:p>
         </w:tc>
+        <w:tc>
+          <w:tcPr/>
+          <w:p>
+            <w:pPr>
+              <w:pStyle w:val="Compact"/>
+              <w:jc w:val="left"/>
+            </w:pPr>
+            <w:r>
+              <w:t xml:space="preserve">Built, in review</w:t>
+            </w:r>
+          </w:p>
+        </w:tc>
       </w:tr>
       <w:tr>
         <w:tc>
@@ -5215,6 +5461,18 @@
             </w:r>
           </w:p>
         </w:tc>
+        <w:tc>
+          <w:tcPr/>
+          <w:p>
+            <w:pPr>
+              <w:pStyle w:val="Compact"/>
+              <w:jc w:val="left"/>
+            </w:pPr>
+            <w:r>
+              <w:t xml:space="preserve">Built, in review</w:t>
+            </w:r>
+          </w:p>
+        </w:tc>
       </w:tr>
       <w:tr>
         <w:tc>
@@ -5253,6 +5511,18 @@
             </w:r>
           </w:p>
         </w:tc>
+        <w:tc>
+          <w:tcPr/>
+          <w:p>
+            <w:pPr>
+              <w:pStyle w:val="Compact"/>
+              <w:jc w:val="left"/>
+            </w:pPr>
+            <w:r>
+              <w:t xml:space="preserve">Built, in review</w:t>
+            </w:r>
+          </w:p>
+        </w:tc>
       </w:tr>
       <w:tr>
         <w:tc>
@@ -5291,6 +5561,18 @@
             </w:r>
           </w:p>
         </w:tc>
+        <w:tc>
+          <w:tcPr/>
+          <w:p>
+            <w:pPr>
+              <w:pStyle w:val="Compact"/>
+              <w:jc w:val="left"/>
+            </w:pPr>
+            <w:r>
+              <w:t xml:space="preserve">Built, in review</w:t>
+            </w:r>
+          </w:p>
+        </w:tc>
       </w:tr>
       <w:tr>
         <w:tc>
@@ -5329,6 +5611,18 @@
             </w:r>
           </w:p>
         </w:tc>
+        <w:tc>
+          <w:tcPr/>
+          <w:p>
+            <w:pPr>
+              <w:pStyle w:val="Compact"/>
+              <w:jc w:val="left"/>
+            </w:pPr>
+            <w:r>
+              <w:t xml:space="preserve">Built, in review</w:t>
+            </w:r>
+          </w:p>
+        </w:tc>
       </w:tr>
       <w:tr>
         <w:tc>
@@ -5367,6 +5661,18 @@
             </w:r>
           </w:p>
         </w:tc>
+        <w:tc>
+          <w:tcPr/>
+          <w:p>
+            <w:pPr>
+              <w:pStyle w:val="Compact"/>
+              <w:jc w:val="left"/>
+            </w:pPr>
+            <w:r>
+              <w:t xml:space="preserve">Built, in review</w:t>
+            </w:r>
+          </w:p>
+        </w:tc>
       </w:tr>
       <w:tr>
         <w:tc>
@@ -5405,6 +5711,18 @@
             </w:r>
           </w:p>
         </w:tc>
+        <w:tc>
+          <w:tcPr/>
+          <w:p>
+            <w:pPr>
+              <w:pStyle w:val="Compact"/>
+              <w:jc w:val="left"/>
+            </w:pPr>
+            <w:r>
+              <w:t xml:space="preserve">Planned (v1.1)</w:t>
+            </w:r>
+          </w:p>
+        </w:tc>
       </w:tr>
       <w:tr>
         <w:tc>
@@ -5443,6 +5761,18 @@
             </w:r>
           </w:p>
         </w:tc>
+        <w:tc>
+          <w:tcPr/>
+          <w:p>
+            <w:pPr>
+              <w:pStyle w:val="Compact"/>
+              <w:jc w:val="left"/>
+            </w:pPr>
+            <w:r>
+              <w:t xml:space="preserve">Built, in review</w:t>
+            </w:r>
+          </w:p>
+        </w:tc>
       </w:tr>
       <w:tr>
         <w:tc>
@@ -5478,6 +5808,18 @@
             </w:pPr>
             <w:r>
               <w:t xml:space="preserve">C</w:t>
+            </w:r>
+          </w:p>
+        </w:tc>
+        <w:tc>
+          <w:tcPr/>
+          <w:p>
+            <w:pPr>
+              <w:pStyle w:val="Compact"/>
+              <w:jc w:val="left"/>
+            </w:pPr>
+            <w:r>
+              <w:t xml:space="preserve">Backlog</w:t>
             </w:r>
           </w:p>
         </w:tc>
@@ -5824,9 +6166,10 @@
         </w:tblBorders>
       </w:tblPr>
       <w:tblGrid>
-        <w:gridCol w:w="1320"/>
-        <w:gridCol w:w="5280"/>
-        <w:gridCol w:w="1320"/>
+        <w:gridCol w:w="792"/>
+        <w:gridCol w:w="3168"/>
+        <w:gridCol w:w="792"/>
+        <w:gridCol w:w="3168"/>
       </w:tblGrid>
       <w:tr>
         <w:trPr>
@@ -5883,6 +6226,23 @@
             </w:r>
           </w:p>
         </w:tc>
+        <w:tc>
+          <w:tcPr>
+            <w:shd w:val="clear" w:fill="E8EEF6"/>
+          </w:tcPr>
+          <w:p>
+            <w:pPr>
+              <w:pStyle w:val="Compact"/>
+              <w:jc w:val="left"/>
+            </w:pPr>
+            <w:r>
+              <w:rPr>
+                <w:b/>
+              </w:rPr>
+              <w:t xml:space="preserve">Status</w:t>
+            </w:r>
+          </w:p>
+        </w:tc>
       </w:tr>
       <w:tr>
         <w:tc>
@@ -5918,6 +6278,68 @@
             </w:pPr>
             <w:r>
               <w:t xml:space="preserve">M</w:t>
+            </w:r>
+          </w:p>
+        </w:tc>
+        <w:tc>
+          <w:tcPr/>
+          <w:p>
+            <w:pPr>
+              <w:pStyle w:val="Compact"/>
+              <w:jc w:val="left"/>
+            </w:pPr>
+            <w:r>
+              <w:t xml:space="preserve">Partly built (submitted, needs approval, second approval, approved, declined, booked or changed by HR, reminders and escalation; year-end preview and statutory warning emails pending)</w:t>
+            </w:r>
+          </w:p>
+        </w:tc>
+      </w:tr>
+      <w:tr>
+        <w:tc>
+          <w:tcPr/>
+          <w:p>
+            <w:pPr>
+              <w:pStyle w:val="Compact"/>
+              <w:jc w:val="left"/>
+            </w:pPr>
+            <w:r>
+              <w:t xml:space="preserve">FR-101</w:t>
+            </w:r>
+          </w:p>
+        </w:tc>
+        <w:tc>
+          <w:tcPr/>
+          <w:p>
+            <w:pPr>
+              <w:pStyle w:val="Compact"/>
+              <w:jc w:val="left"/>
+            </w:pPr>
+            <w:r>
+              <w:t xml:space="preserve">Reminders of upcoming time off to the person and their manager, by email and in calendar feeds. On by default at 5 days and 1 day before; each person can turn them off or change the timing.</w:t>
+            </w:r>
+          </w:p>
+        </w:tc>
+        <w:tc>
+          <w:tcPr/>
+          <w:p>
+            <w:pPr>
+              <w:pStyle w:val="Compact"/>
+              <w:jc w:val="left"/>
+            </w:pPr>
+            <w:r>
+              <w:t xml:space="preserve">M</w:t>
+            </w:r>
+          </w:p>
+        </w:tc>
+        <w:tc>
+          <w:tcPr/>
+          <w:p>
+            <w:pPr>
+              <w:pStyle w:val="Compact"/>
+              <w:jc w:val="left"/>
+            </w:pPr>
+            <w:r>
+              <w:t xml:space="preserve">Pending</w:t>
             </w:r>
           </w:p>
         </w:tc>
@@ -7684,6 +8106,44 @@
           </w:p>
         </w:tc>
       </w:tr>
+      <w:tr>
+        <w:tc>
+          <w:tcPr/>
+          <w:p>
+            <w:pPr>
+              <w:pStyle w:val="Compact"/>
+              <w:jc w:val="left"/>
+            </w:pPr>
+            <w:r>
+              <w:t xml:space="preserve">D10</w:t>
+            </w:r>
+          </w:p>
+        </w:tc>
+        <w:tc>
+          <w:tcPr/>
+          <w:p>
+            <w:pPr>
+              <w:pStyle w:val="Compact"/>
+              <w:jc w:val="left"/>
+            </w:pPr>
+            <w:r>
+              <w:t xml:space="preserve">Defaults chosen during the build, to confirm: automatic and HR-approved plans skip the second approval; cancelling approved future time needs approval unless a plan turns it off; Quebec observes Good Friday (HR can switch to Easter Monday); US companies start with all 11 federal holidays; Canadian statutory protection at year end counts carried days toward the minimum</w:t>
+            </w:r>
+          </w:p>
+        </w:tc>
+        <w:tc>
+          <w:tcPr/>
+          <w:p>
+            <w:pPr>
+              <w:pStyle w:val="Compact"/>
+              <w:jc w:val="left"/>
+            </w:pPr>
+            <w:r>
+              <w:t xml:space="preserve">Before release</w:t>
+            </w:r>
+          </w:p>
+        </w:tc>
+      </w:tr>
     </w:tbl>
     <w:bookmarkEnd w:id="43"/>
     <w:bookmarkStart w:id="44" w:name="glossary"/>
@@ -8144,6 +8604,44 @@
             </w:pPr>
             <w:r>
               <w:t xml:space="preserve">FR-30 to FR-42 status added: plans, levels, assignments, accrual engine, year-end carryover and expiry, jurisdiction overrides and balances built. Added FR-43 (plan settings lock once balances exist). Backlog: persona demo videos with captions, guided in-app help, French interface for Quebec as a future item (no Quebec companies or staff today).</w:t>
+            </w:r>
+          </w:p>
+        </w:tc>
+      </w:tr>
+      <w:tr>
+        <w:tc>
+          <w:tcPr/>
+          <w:p>
+            <w:pPr>
+              <w:pStyle w:val="Compact"/>
+              <w:jc w:val="left"/>
+            </w:pPr>
+            <w:r>
+              <w:t xml:space="preserve">1.4</w:t>
+            </w:r>
+          </w:p>
+        </w:tc>
+        <w:tc>
+          <w:tcPr/>
+          <w:p>
+            <w:pPr>
+              <w:pStyle w:val="Compact"/>
+              <w:jc w:val="left"/>
+            </w:pPr>
+            <w:r>
+              <w:t xml:space="preserve">24 Oct 2026</w:t>
+            </w:r>
+          </w:p>
+        </w:tc>
+        <w:tc>
+          <w:tcPr/>
+          <w:p>
+            <w:pPr>
+              <w:pStyle w:val="Compact"/>
+              <w:jc w:val="left"/>
+            </w:pPr>
+            <w:r>
+              <w:t xml:space="preserve">Status added for FR-50 to FR-57, FR-60 to FR-64, FR-70 to FR-80 and FR-100. Requests and approvals, reminders, escalation and backup approvers built; holidays built; team calendar, calendar feeds and reports built and in review. Added FR-101 (reminders of upcoming time off). Added D10 (defaults to confirm).</w:t>
             </w:r>
           </w:p>
         </w:tc>

</xml_diff>